<commit_message>
Update README and technical report for registry validation and 78 tests
</commit_message>
<xml_diff>
--- a/docs/Technical Report - Summative.docx
+++ b/docs/Technical Report - Summative.docx
@@ -2112,7 +2112,7 @@
           <w:b w:val="0"/>
           <w:i w:val="0"/>
         </w:rPr>
-        <w:t>At startup the program reads books.txt (book_id,title,author), members.txt (member_id,full_name,course_code) and copies.txt (copy_id,book_id,condition). It prints an error and stops if a file is missing or empty. Malformed lines, duplicate IDs and copies of unknown books are skipped with a warning. IDs are stored in upper case. register_member, register_book and add_copy add new entries and append them to the same files, so they are loaded again on the next start.</w:t>
+        <w:t>At startup the program reads books.txt (book_id,title,author), members.txt (member_id,full_name,course_code) and copies.txt (copy_id,book_id,condition). It prints an error and stops if a file is missing or empty. Malformed lines, IDs in the wrong format, fields that are too long, duplicate IDs and copies of unknown books are skipped with a warning. IDs are stored in upper case. register_member, register_book and add_copy add new entries and append them to the same files, so they are loaded again on the next start.</w:t>
       </w:r>
     </w:p>
     <w:p>
@@ -7181,7 +7181,7 @@
           <w:b w:val="0"/>
           <w:i w:val="0"/>
         </w:rPr>
-        <w:t>I tested the program in two ways. First, tests/run_tests.sh (make test) runs the real program in a temporary folder, types commands into it and checks the output. It has 76 checks in 10 groups: first run and registries, restart and reservations, overdue and fines, replay protection and fraud, the review workflow, both token models, pool and cloud mining and difficulty, registration, tamper detection, and access control. The result is:</w:t>
+        <w:t>I tested the program in two ways. First, tests/run_tests.sh (make test) runs the real program in a temporary folder, types commands into it and checks the output. It has 78 checks in 10 groups: first run and registries, restart and reservations, overdue and fines, replay protection and fraud, the review workflow, both token models, pool and cloud mining and difficulty, registration, tamper detection, and access control. The result is:</w:t>
       </w:r>
     </w:p>
     <w:p>
@@ -7220,7 +7220,7 @@
           <w:rFonts w:ascii="Courier New" w:hAnsi="Courier New" w:eastAsia="Courier New"/>
           <w:sz w:val="15"/>
         </w:rPr>
-        <w:t>Result: 76 passed, 0 failed</w:t>
+        <w:t>Result: 78 passed, 0 failed</w:t>
       </w:r>
     </w:p>
     <w:p>

</xml_diff>